<commit_message>
Reorganized file structure and added garbage collection
</commit_message>
<xml_diff>
--- a/post_man_and_api_tester/pm1_postman_basics.docx
+++ b/post_man_and_api_tester/pm1_postman_basics.docx
@@ -4,7 +4,7 @@
   <w:body>
     <w:p>
       <w:pPr>
-        <w:jc w:val="center"/>
+        <w:jc w:val="both"/>
         <w:rPr>
           <w:b/>
           <w:bCs/>
@@ -24,14 +24,16 @@
     </w:p>
     <w:p>
       <w:pPr>
-        <w:rPr>
-          <w:sz w:val="36"/>
-          <w:szCs w:val="36"/>
-        </w:rPr>
-      </w:pPr>
-    </w:p>
-    <w:p>
-      <w:pPr>
+        <w:jc w:val="both"/>
+        <w:rPr>
+          <w:sz w:val="36"/>
+          <w:szCs w:val="36"/>
+        </w:rPr>
+      </w:pPr>
+    </w:p>
+    <w:p>
+      <w:pPr>
+        <w:jc w:val="both"/>
         <w:rPr>
           <w:sz w:val="36"/>
           <w:szCs w:val="36"/>
@@ -47,6 +49,7 @@
     </w:p>
     <w:p>
       <w:pPr>
+        <w:jc w:val="both"/>
         <w:rPr>
           <w:b/>
           <w:bCs/>
@@ -67,6 +70,7 @@
     </w:p>
     <w:p>
       <w:pPr>
+        <w:jc w:val="both"/>
         <w:rPr>
           <w:sz w:val="36"/>
           <w:szCs w:val="36"/>
@@ -128,6 +132,7 @@
     </w:p>
     <w:p>
       <w:pPr>
+        <w:jc w:val="both"/>
         <w:rPr>
           <w:sz w:val="36"/>
           <w:szCs w:val="36"/>
@@ -203,62 +208,70 @@
     </w:p>
     <w:p>
       <w:pPr>
-        <w:rPr>
-          <w:sz w:val="36"/>
-          <w:szCs w:val="36"/>
-        </w:rPr>
-      </w:pPr>
-    </w:p>
-    <w:p>
-      <w:pPr>
-        <w:rPr>
-          <w:sz w:val="36"/>
-          <w:szCs w:val="36"/>
-        </w:rPr>
-      </w:pPr>
-    </w:p>
-    <w:p>
-      <w:pPr>
-        <w:rPr>
-          <w:sz w:val="36"/>
-          <w:szCs w:val="36"/>
-        </w:rPr>
-      </w:pPr>
-    </w:p>
-    <w:p>
-      <w:pPr>
-        <w:rPr>
-          <w:sz w:val="36"/>
-          <w:szCs w:val="36"/>
-        </w:rPr>
-      </w:pPr>
-    </w:p>
-    <w:p>
-      <w:pPr>
-        <w:rPr>
-          <w:sz w:val="36"/>
-          <w:szCs w:val="36"/>
-        </w:rPr>
-      </w:pPr>
-    </w:p>
-    <w:p>
-      <w:pPr>
-        <w:rPr>
-          <w:sz w:val="36"/>
-          <w:szCs w:val="36"/>
-        </w:rPr>
-      </w:pPr>
-    </w:p>
-    <w:p>
-      <w:pPr>
-        <w:rPr>
-          <w:sz w:val="36"/>
-          <w:szCs w:val="36"/>
-        </w:rPr>
-      </w:pPr>
-    </w:p>
-    <w:p>
-      <w:pPr>
+        <w:jc w:val="both"/>
+        <w:rPr>
+          <w:sz w:val="36"/>
+          <w:szCs w:val="36"/>
+        </w:rPr>
+      </w:pPr>
+    </w:p>
+    <w:p>
+      <w:pPr>
+        <w:jc w:val="both"/>
+        <w:rPr>
+          <w:sz w:val="36"/>
+          <w:szCs w:val="36"/>
+        </w:rPr>
+      </w:pPr>
+    </w:p>
+    <w:p>
+      <w:pPr>
+        <w:jc w:val="both"/>
+        <w:rPr>
+          <w:sz w:val="36"/>
+          <w:szCs w:val="36"/>
+        </w:rPr>
+      </w:pPr>
+    </w:p>
+    <w:p>
+      <w:pPr>
+        <w:jc w:val="both"/>
+        <w:rPr>
+          <w:sz w:val="36"/>
+          <w:szCs w:val="36"/>
+        </w:rPr>
+      </w:pPr>
+    </w:p>
+    <w:p>
+      <w:pPr>
+        <w:jc w:val="both"/>
+        <w:rPr>
+          <w:sz w:val="36"/>
+          <w:szCs w:val="36"/>
+        </w:rPr>
+      </w:pPr>
+    </w:p>
+    <w:p>
+      <w:pPr>
+        <w:jc w:val="both"/>
+        <w:rPr>
+          <w:sz w:val="36"/>
+          <w:szCs w:val="36"/>
+        </w:rPr>
+      </w:pPr>
+    </w:p>
+    <w:p>
+      <w:pPr>
+        <w:jc w:val="both"/>
+        <w:rPr>
+          <w:sz w:val="36"/>
+          <w:szCs w:val="36"/>
+        </w:rPr>
+      </w:pPr>
+    </w:p>
+    <w:p>
+      <w:pPr>
+        <w:jc w:val="both"/>
         <w:rPr>
           <w:sz w:val="36"/>
           <w:szCs w:val="36"/>
@@ -318,14 +331,16 @@
     </w:p>
     <w:p>
       <w:pPr>
-        <w:rPr>
-          <w:sz w:val="36"/>
-          <w:szCs w:val="36"/>
-        </w:rPr>
-      </w:pPr>
-    </w:p>
-    <w:p>
-      <w:pPr>
+        <w:jc w:val="both"/>
+        <w:rPr>
+          <w:sz w:val="36"/>
+          <w:szCs w:val="36"/>
+        </w:rPr>
+      </w:pPr>
+    </w:p>
+    <w:p>
+      <w:pPr>
+        <w:jc w:val="both"/>
         <w:rPr>
           <w:sz w:val="36"/>
           <w:szCs w:val="36"/>
@@ -401,46 +416,52 @@
     </w:p>
     <w:p>
       <w:pPr>
-        <w:rPr>
-          <w:sz w:val="36"/>
-          <w:szCs w:val="36"/>
-        </w:rPr>
-      </w:pPr>
-    </w:p>
-    <w:p>
-      <w:pPr>
-        <w:rPr>
-          <w:sz w:val="36"/>
-          <w:szCs w:val="36"/>
-        </w:rPr>
-      </w:pPr>
-    </w:p>
-    <w:p>
-      <w:pPr>
-        <w:rPr>
-          <w:sz w:val="36"/>
-          <w:szCs w:val="36"/>
-        </w:rPr>
-      </w:pPr>
-    </w:p>
-    <w:p>
-      <w:pPr>
-        <w:rPr>
-          <w:sz w:val="36"/>
-          <w:szCs w:val="36"/>
-        </w:rPr>
-      </w:pPr>
-    </w:p>
-    <w:p>
-      <w:pPr>
-        <w:rPr>
-          <w:sz w:val="36"/>
-          <w:szCs w:val="36"/>
-        </w:rPr>
-      </w:pPr>
-    </w:p>
-    <w:p>
-      <w:pPr>
+        <w:jc w:val="both"/>
+        <w:rPr>
+          <w:sz w:val="36"/>
+          <w:szCs w:val="36"/>
+        </w:rPr>
+      </w:pPr>
+    </w:p>
+    <w:p>
+      <w:pPr>
+        <w:jc w:val="both"/>
+        <w:rPr>
+          <w:sz w:val="36"/>
+          <w:szCs w:val="36"/>
+        </w:rPr>
+      </w:pPr>
+    </w:p>
+    <w:p>
+      <w:pPr>
+        <w:jc w:val="both"/>
+        <w:rPr>
+          <w:sz w:val="36"/>
+          <w:szCs w:val="36"/>
+        </w:rPr>
+      </w:pPr>
+    </w:p>
+    <w:p>
+      <w:pPr>
+        <w:jc w:val="both"/>
+        <w:rPr>
+          <w:sz w:val="36"/>
+          <w:szCs w:val="36"/>
+        </w:rPr>
+      </w:pPr>
+    </w:p>
+    <w:p>
+      <w:pPr>
+        <w:jc w:val="both"/>
+        <w:rPr>
+          <w:sz w:val="36"/>
+          <w:szCs w:val="36"/>
+        </w:rPr>
+      </w:pPr>
+    </w:p>
+    <w:p>
+      <w:pPr>
+        <w:jc w:val="both"/>
         <w:rPr>
           <w:sz w:val="36"/>
           <w:szCs w:val="36"/>
@@ -457,6 +478,7 @@
     </w:p>
     <w:p>
       <w:pPr>
+        <w:jc w:val="both"/>
         <w:rPr>
           <w:sz w:val="36"/>
           <w:szCs w:val="36"/>
@@ -532,94 +554,106 @@
     </w:p>
     <w:p>
       <w:pPr>
-        <w:rPr>
-          <w:sz w:val="36"/>
-          <w:szCs w:val="36"/>
-        </w:rPr>
-      </w:pPr>
-    </w:p>
-    <w:p>
-      <w:pPr>
-        <w:rPr>
-          <w:sz w:val="36"/>
-          <w:szCs w:val="36"/>
-        </w:rPr>
-      </w:pPr>
-    </w:p>
-    <w:p>
-      <w:pPr>
-        <w:rPr>
-          <w:sz w:val="36"/>
-          <w:szCs w:val="36"/>
-        </w:rPr>
-      </w:pPr>
-    </w:p>
-    <w:p>
-      <w:pPr>
-        <w:rPr>
-          <w:sz w:val="36"/>
-          <w:szCs w:val="36"/>
-        </w:rPr>
-      </w:pPr>
-    </w:p>
-    <w:p>
-      <w:pPr>
-        <w:rPr>
-          <w:sz w:val="36"/>
-          <w:szCs w:val="36"/>
-        </w:rPr>
-      </w:pPr>
-    </w:p>
-    <w:p>
-      <w:pPr>
-        <w:rPr>
-          <w:sz w:val="36"/>
-          <w:szCs w:val="36"/>
-        </w:rPr>
-      </w:pPr>
-    </w:p>
-    <w:p>
-      <w:pPr>
-        <w:rPr>
-          <w:sz w:val="36"/>
-          <w:szCs w:val="36"/>
-        </w:rPr>
-      </w:pPr>
-    </w:p>
-    <w:p>
-      <w:pPr>
-        <w:rPr>
-          <w:sz w:val="36"/>
-          <w:szCs w:val="36"/>
-        </w:rPr>
-      </w:pPr>
-    </w:p>
-    <w:p>
-      <w:pPr>
-        <w:rPr>
-          <w:sz w:val="36"/>
-          <w:szCs w:val="36"/>
-        </w:rPr>
-      </w:pPr>
-    </w:p>
-    <w:p>
-      <w:pPr>
-        <w:rPr>
-          <w:sz w:val="36"/>
-          <w:szCs w:val="36"/>
-        </w:rPr>
-      </w:pPr>
-    </w:p>
-    <w:p>
-      <w:pPr>
-        <w:rPr>
-          <w:sz w:val="36"/>
-          <w:szCs w:val="36"/>
-        </w:rPr>
-      </w:pPr>
-    </w:p>
-    <w:p>
-      <w:pPr>
+        <w:jc w:val="both"/>
+        <w:rPr>
+          <w:sz w:val="36"/>
+          <w:szCs w:val="36"/>
+        </w:rPr>
+      </w:pPr>
+    </w:p>
+    <w:p>
+      <w:pPr>
+        <w:jc w:val="both"/>
+        <w:rPr>
+          <w:sz w:val="36"/>
+          <w:szCs w:val="36"/>
+        </w:rPr>
+      </w:pPr>
+    </w:p>
+    <w:p>
+      <w:pPr>
+        <w:jc w:val="both"/>
+        <w:rPr>
+          <w:sz w:val="36"/>
+          <w:szCs w:val="36"/>
+        </w:rPr>
+      </w:pPr>
+    </w:p>
+    <w:p>
+      <w:pPr>
+        <w:jc w:val="both"/>
+        <w:rPr>
+          <w:sz w:val="36"/>
+          <w:szCs w:val="36"/>
+        </w:rPr>
+      </w:pPr>
+    </w:p>
+    <w:p>
+      <w:pPr>
+        <w:jc w:val="both"/>
+        <w:rPr>
+          <w:sz w:val="36"/>
+          <w:szCs w:val="36"/>
+        </w:rPr>
+      </w:pPr>
+    </w:p>
+    <w:p>
+      <w:pPr>
+        <w:jc w:val="both"/>
+        <w:rPr>
+          <w:sz w:val="36"/>
+          <w:szCs w:val="36"/>
+        </w:rPr>
+      </w:pPr>
+    </w:p>
+    <w:p>
+      <w:pPr>
+        <w:jc w:val="both"/>
+        <w:rPr>
+          <w:sz w:val="36"/>
+          <w:szCs w:val="36"/>
+        </w:rPr>
+      </w:pPr>
+    </w:p>
+    <w:p>
+      <w:pPr>
+        <w:jc w:val="both"/>
+        <w:rPr>
+          <w:sz w:val="36"/>
+          <w:szCs w:val="36"/>
+        </w:rPr>
+      </w:pPr>
+    </w:p>
+    <w:p>
+      <w:pPr>
+        <w:jc w:val="both"/>
+        <w:rPr>
+          <w:sz w:val="36"/>
+          <w:szCs w:val="36"/>
+        </w:rPr>
+      </w:pPr>
+    </w:p>
+    <w:p>
+      <w:pPr>
+        <w:jc w:val="both"/>
+        <w:rPr>
+          <w:sz w:val="36"/>
+          <w:szCs w:val="36"/>
+        </w:rPr>
+      </w:pPr>
+    </w:p>
+    <w:p>
+      <w:pPr>
+        <w:jc w:val="both"/>
+        <w:rPr>
+          <w:sz w:val="36"/>
+          <w:szCs w:val="36"/>
+        </w:rPr>
+      </w:pPr>
+    </w:p>
+    <w:p>
+      <w:pPr>
+        <w:jc w:val="both"/>
         <w:rPr>
           <w:sz w:val="36"/>
           <w:szCs w:val="36"/>
@@ -674,6 +708,7 @@
     </w:p>
     <w:p>
       <w:pPr>
+        <w:jc w:val="both"/>
         <w:rPr>
           <w:sz w:val="36"/>
           <w:szCs w:val="36"/>
@@ -684,7 +719,7 @@
           <w:noProof/>
         </w:rPr>
         <w:drawing>
-          <wp:anchor distT="0" distB="0" distL="114300" distR="114300" simplePos="0" relativeHeight="251661312" behindDoc="0" locked="0" layoutInCell="1" allowOverlap="1" wp14:anchorId="71319E98" wp14:editId="589B4B04">
+          <wp:anchor distT="0" distB="0" distL="114300" distR="114300" simplePos="0" relativeHeight="251661312" behindDoc="0" locked="0" layoutInCell="1" allowOverlap="1" wp14:anchorId="71319E98" wp14:editId="1C885C4F">
             <wp:simplePos x="0" y="0"/>
             <wp:positionH relativeFrom="margin">
               <wp:align>center</wp:align>
@@ -749,38 +784,43 @@
     </w:p>
     <w:p>
       <w:pPr>
-        <w:rPr>
-          <w:sz w:val="36"/>
-          <w:szCs w:val="36"/>
-        </w:rPr>
-      </w:pPr>
-    </w:p>
-    <w:p>
-      <w:pPr>
-        <w:rPr>
-          <w:sz w:val="36"/>
-          <w:szCs w:val="36"/>
-        </w:rPr>
-      </w:pPr>
-    </w:p>
-    <w:p>
-      <w:pPr>
-        <w:rPr>
-          <w:sz w:val="36"/>
-          <w:szCs w:val="36"/>
-        </w:rPr>
-      </w:pPr>
-    </w:p>
-    <w:p>
-      <w:pPr>
-        <w:rPr>
-          <w:sz w:val="36"/>
-          <w:szCs w:val="36"/>
-        </w:rPr>
-      </w:pPr>
-    </w:p>
-    <w:p>
-      <w:pPr>
+        <w:jc w:val="both"/>
+        <w:rPr>
+          <w:sz w:val="36"/>
+          <w:szCs w:val="36"/>
+        </w:rPr>
+      </w:pPr>
+    </w:p>
+    <w:p>
+      <w:pPr>
+        <w:jc w:val="both"/>
+        <w:rPr>
+          <w:sz w:val="36"/>
+          <w:szCs w:val="36"/>
+        </w:rPr>
+      </w:pPr>
+    </w:p>
+    <w:p>
+      <w:pPr>
+        <w:jc w:val="both"/>
+        <w:rPr>
+          <w:sz w:val="36"/>
+          <w:szCs w:val="36"/>
+        </w:rPr>
+      </w:pPr>
+    </w:p>
+    <w:p>
+      <w:pPr>
+        <w:jc w:val="both"/>
+        <w:rPr>
+          <w:sz w:val="36"/>
+          <w:szCs w:val="36"/>
+        </w:rPr>
+      </w:pPr>
+    </w:p>
+    <w:p>
+      <w:pPr>
+        <w:jc w:val="both"/>
         <w:rPr>
           <w:sz w:val="36"/>
           <w:szCs w:val="36"/>
@@ -900,6 +940,7 @@
     </w:p>
     <w:p>
       <w:pPr>
+        <w:jc w:val="both"/>
         <w:rPr>
           <w:sz w:val="36"/>
           <w:szCs w:val="36"/>
@@ -910,7 +951,7 @@
           <w:noProof/>
         </w:rPr>
         <w:drawing>
-          <wp:anchor distT="0" distB="0" distL="114300" distR="114300" simplePos="0" relativeHeight="251662336" behindDoc="0" locked="0" layoutInCell="1" allowOverlap="1" wp14:anchorId="15467FBA" wp14:editId="0C529E9B">
+          <wp:anchor distT="0" distB="0" distL="114300" distR="114300" simplePos="0" relativeHeight="251662336" behindDoc="0" locked="0" layoutInCell="1" allowOverlap="1" wp14:anchorId="15467FBA" wp14:editId="4FC03A46">
             <wp:simplePos x="0" y="0"/>
             <wp:positionH relativeFrom="margin">
               <wp:align>right</wp:align>
@@ -975,70 +1016,79 @@
     </w:p>
     <w:p>
       <w:pPr>
-        <w:rPr>
-          <w:sz w:val="36"/>
-          <w:szCs w:val="36"/>
-        </w:rPr>
-      </w:pPr>
-    </w:p>
-    <w:p>
-      <w:pPr>
-        <w:rPr>
-          <w:sz w:val="36"/>
-          <w:szCs w:val="36"/>
-        </w:rPr>
-      </w:pPr>
-    </w:p>
-    <w:p>
-      <w:pPr>
-        <w:rPr>
-          <w:sz w:val="36"/>
-          <w:szCs w:val="36"/>
-        </w:rPr>
-      </w:pPr>
-    </w:p>
-    <w:p>
-      <w:pPr>
-        <w:rPr>
-          <w:sz w:val="36"/>
-          <w:szCs w:val="36"/>
-        </w:rPr>
-      </w:pPr>
-    </w:p>
-    <w:p>
-      <w:pPr>
-        <w:rPr>
-          <w:sz w:val="36"/>
-          <w:szCs w:val="36"/>
-        </w:rPr>
-      </w:pPr>
-    </w:p>
-    <w:p>
-      <w:pPr>
-        <w:rPr>
-          <w:sz w:val="36"/>
-          <w:szCs w:val="36"/>
-        </w:rPr>
-      </w:pPr>
-    </w:p>
-    <w:p>
-      <w:pPr>
-        <w:rPr>
-          <w:sz w:val="36"/>
-          <w:szCs w:val="36"/>
-        </w:rPr>
-      </w:pPr>
-    </w:p>
-    <w:p>
-      <w:pPr>
-        <w:rPr>
-          <w:sz w:val="36"/>
-          <w:szCs w:val="36"/>
-        </w:rPr>
-      </w:pPr>
-    </w:p>
-    <w:p>
-      <w:pPr>
+        <w:jc w:val="both"/>
+        <w:rPr>
+          <w:sz w:val="36"/>
+          <w:szCs w:val="36"/>
+        </w:rPr>
+      </w:pPr>
+    </w:p>
+    <w:p>
+      <w:pPr>
+        <w:jc w:val="both"/>
+        <w:rPr>
+          <w:sz w:val="36"/>
+          <w:szCs w:val="36"/>
+        </w:rPr>
+      </w:pPr>
+    </w:p>
+    <w:p>
+      <w:pPr>
+        <w:jc w:val="both"/>
+        <w:rPr>
+          <w:sz w:val="36"/>
+          <w:szCs w:val="36"/>
+        </w:rPr>
+      </w:pPr>
+    </w:p>
+    <w:p>
+      <w:pPr>
+        <w:jc w:val="both"/>
+        <w:rPr>
+          <w:sz w:val="36"/>
+          <w:szCs w:val="36"/>
+        </w:rPr>
+      </w:pPr>
+    </w:p>
+    <w:p>
+      <w:pPr>
+        <w:jc w:val="both"/>
+        <w:rPr>
+          <w:sz w:val="36"/>
+          <w:szCs w:val="36"/>
+        </w:rPr>
+      </w:pPr>
+    </w:p>
+    <w:p>
+      <w:pPr>
+        <w:jc w:val="both"/>
+        <w:rPr>
+          <w:sz w:val="36"/>
+          <w:szCs w:val="36"/>
+        </w:rPr>
+      </w:pPr>
+    </w:p>
+    <w:p>
+      <w:pPr>
+        <w:jc w:val="both"/>
+        <w:rPr>
+          <w:sz w:val="36"/>
+          <w:szCs w:val="36"/>
+        </w:rPr>
+      </w:pPr>
+    </w:p>
+    <w:p>
+      <w:pPr>
+        <w:jc w:val="both"/>
+        <w:rPr>
+          <w:sz w:val="36"/>
+          <w:szCs w:val="36"/>
+        </w:rPr>
+      </w:pPr>
+    </w:p>
+    <w:p>
+      <w:pPr>
+        <w:jc w:val="both"/>
         <w:rPr>
           <w:sz w:val="36"/>
           <w:szCs w:val="36"/>
@@ -1077,14 +1127,16 @@
     </w:p>
     <w:p>
       <w:pPr>
-        <w:rPr>
-          <w:sz w:val="36"/>
-          <w:szCs w:val="36"/>
-        </w:rPr>
-      </w:pPr>
-    </w:p>
-    <w:p>
-      <w:pPr>
+        <w:jc w:val="both"/>
+        <w:rPr>
+          <w:sz w:val="36"/>
+          <w:szCs w:val="36"/>
+        </w:rPr>
+      </w:pPr>
+    </w:p>
+    <w:p>
+      <w:pPr>
+        <w:jc w:val="both"/>
         <w:rPr>
           <w:sz w:val="36"/>
           <w:szCs w:val="36"/>
@@ -1179,7 +1231,7 @@
           <w:sz w:val="36"/>
           <w:szCs w:val="36"/>
         </w:rPr>
-        <w:t xml:space="preserve">. We </w:t>
+        <w:t xml:space="preserve">. We can </w:t>
       </w:r>
       <w:r>
         <w:rPr>
@@ -1187,7 +1239,7 @@
           <w:szCs w:val="36"/>
         </w:rPr>
         <w:lastRenderedPageBreak/>
-        <w:t xml:space="preserve">can set the </w:t>
+        <w:t xml:space="preserve">set the </w:t>
       </w:r>
       <w:r>
         <w:rPr>
@@ -1308,6 +1360,7 @@
     </w:p>
     <w:p>
       <w:pPr>
+        <w:jc w:val="both"/>
         <w:rPr>
           <w:sz w:val="36"/>
           <w:szCs w:val="36"/>
@@ -1378,70 +1431,79 @@
     </w:p>
     <w:p>
       <w:pPr>
-        <w:rPr>
-          <w:sz w:val="36"/>
-          <w:szCs w:val="36"/>
-        </w:rPr>
-      </w:pPr>
-    </w:p>
-    <w:p>
-      <w:pPr>
-        <w:rPr>
-          <w:sz w:val="36"/>
-          <w:szCs w:val="36"/>
-        </w:rPr>
-      </w:pPr>
-    </w:p>
-    <w:p>
-      <w:pPr>
-        <w:rPr>
-          <w:sz w:val="36"/>
-          <w:szCs w:val="36"/>
-        </w:rPr>
-      </w:pPr>
-    </w:p>
-    <w:p>
-      <w:pPr>
-        <w:rPr>
-          <w:sz w:val="36"/>
-          <w:szCs w:val="36"/>
-        </w:rPr>
-      </w:pPr>
-    </w:p>
-    <w:p>
-      <w:pPr>
-        <w:rPr>
-          <w:sz w:val="36"/>
-          <w:szCs w:val="36"/>
-        </w:rPr>
-      </w:pPr>
-    </w:p>
-    <w:p>
-      <w:pPr>
-        <w:rPr>
-          <w:sz w:val="36"/>
-          <w:szCs w:val="36"/>
-        </w:rPr>
-      </w:pPr>
-    </w:p>
-    <w:p>
-      <w:pPr>
-        <w:rPr>
-          <w:sz w:val="36"/>
-          <w:szCs w:val="36"/>
-        </w:rPr>
-      </w:pPr>
-    </w:p>
-    <w:p>
-      <w:pPr>
-        <w:rPr>
-          <w:sz w:val="36"/>
-          <w:szCs w:val="36"/>
-        </w:rPr>
-      </w:pPr>
-    </w:p>
-    <w:p>
-      <w:pPr>
+        <w:jc w:val="both"/>
+        <w:rPr>
+          <w:sz w:val="36"/>
+          <w:szCs w:val="36"/>
+        </w:rPr>
+      </w:pPr>
+    </w:p>
+    <w:p>
+      <w:pPr>
+        <w:jc w:val="both"/>
+        <w:rPr>
+          <w:sz w:val="36"/>
+          <w:szCs w:val="36"/>
+        </w:rPr>
+      </w:pPr>
+    </w:p>
+    <w:p>
+      <w:pPr>
+        <w:jc w:val="both"/>
+        <w:rPr>
+          <w:sz w:val="36"/>
+          <w:szCs w:val="36"/>
+        </w:rPr>
+      </w:pPr>
+    </w:p>
+    <w:p>
+      <w:pPr>
+        <w:jc w:val="both"/>
+        <w:rPr>
+          <w:sz w:val="36"/>
+          <w:szCs w:val="36"/>
+        </w:rPr>
+      </w:pPr>
+    </w:p>
+    <w:p>
+      <w:pPr>
+        <w:jc w:val="both"/>
+        <w:rPr>
+          <w:sz w:val="36"/>
+          <w:szCs w:val="36"/>
+        </w:rPr>
+      </w:pPr>
+    </w:p>
+    <w:p>
+      <w:pPr>
+        <w:jc w:val="both"/>
+        <w:rPr>
+          <w:sz w:val="36"/>
+          <w:szCs w:val="36"/>
+        </w:rPr>
+      </w:pPr>
+    </w:p>
+    <w:p>
+      <w:pPr>
+        <w:jc w:val="both"/>
+        <w:rPr>
+          <w:sz w:val="36"/>
+          <w:szCs w:val="36"/>
+        </w:rPr>
+      </w:pPr>
+    </w:p>
+    <w:p>
+      <w:pPr>
+        <w:jc w:val="both"/>
+        <w:rPr>
+          <w:sz w:val="36"/>
+          <w:szCs w:val="36"/>
+        </w:rPr>
+      </w:pPr>
+    </w:p>
+    <w:p>
+      <w:pPr>
+        <w:jc w:val="both"/>
         <w:rPr>
           <w:sz w:val="36"/>
           <w:szCs w:val="36"/>
@@ -1457,6 +1519,7 @@
     </w:p>
     <w:p>
       <w:pPr>
+        <w:jc w:val="both"/>
         <w:rPr>
           <w:sz w:val="36"/>
           <w:szCs w:val="36"/>
@@ -1662,54 +1725,61 @@
     </w:p>
     <w:p>
       <w:pPr>
-        <w:rPr>
-          <w:sz w:val="36"/>
-          <w:szCs w:val="36"/>
-        </w:rPr>
-      </w:pPr>
-    </w:p>
-    <w:p>
-      <w:pPr>
-        <w:rPr>
-          <w:sz w:val="36"/>
-          <w:szCs w:val="36"/>
-        </w:rPr>
-      </w:pPr>
-    </w:p>
-    <w:p>
-      <w:pPr>
-        <w:rPr>
-          <w:sz w:val="36"/>
-          <w:szCs w:val="36"/>
-        </w:rPr>
-      </w:pPr>
-    </w:p>
-    <w:p>
-      <w:pPr>
-        <w:rPr>
-          <w:sz w:val="36"/>
-          <w:szCs w:val="36"/>
-        </w:rPr>
-      </w:pPr>
-    </w:p>
-    <w:p>
-      <w:pPr>
-        <w:rPr>
-          <w:sz w:val="36"/>
-          <w:szCs w:val="36"/>
-        </w:rPr>
-      </w:pPr>
-    </w:p>
-    <w:p>
-      <w:pPr>
-        <w:rPr>
-          <w:sz w:val="36"/>
-          <w:szCs w:val="36"/>
-        </w:rPr>
-      </w:pPr>
-    </w:p>
-    <w:p>
-      <w:pPr>
+        <w:jc w:val="both"/>
+        <w:rPr>
+          <w:sz w:val="36"/>
+          <w:szCs w:val="36"/>
+        </w:rPr>
+      </w:pPr>
+    </w:p>
+    <w:p>
+      <w:pPr>
+        <w:jc w:val="both"/>
+        <w:rPr>
+          <w:sz w:val="36"/>
+          <w:szCs w:val="36"/>
+        </w:rPr>
+      </w:pPr>
+    </w:p>
+    <w:p>
+      <w:pPr>
+        <w:jc w:val="both"/>
+        <w:rPr>
+          <w:sz w:val="36"/>
+          <w:szCs w:val="36"/>
+        </w:rPr>
+      </w:pPr>
+    </w:p>
+    <w:p>
+      <w:pPr>
+        <w:jc w:val="both"/>
+        <w:rPr>
+          <w:sz w:val="36"/>
+          <w:szCs w:val="36"/>
+        </w:rPr>
+      </w:pPr>
+    </w:p>
+    <w:p>
+      <w:pPr>
+        <w:jc w:val="both"/>
+        <w:rPr>
+          <w:sz w:val="36"/>
+          <w:szCs w:val="36"/>
+        </w:rPr>
+      </w:pPr>
+    </w:p>
+    <w:p>
+      <w:pPr>
+        <w:jc w:val="both"/>
+        <w:rPr>
+          <w:sz w:val="36"/>
+          <w:szCs w:val="36"/>
+        </w:rPr>
+      </w:pPr>
+    </w:p>
+    <w:p>
+      <w:pPr>
+        <w:jc w:val="both"/>
         <w:rPr>
           <w:sz w:val="36"/>
           <w:szCs w:val="36"/>
@@ -1765,6 +1835,7 @@
     </w:p>
     <w:p>
       <w:pPr>
+        <w:jc w:val="both"/>
         <w:rPr>
           <w:sz w:val="36"/>
           <w:szCs w:val="36"/>
@@ -1840,54 +1911,61 @@
     </w:p>
     <w:p>
       <w:pPr>
-        <w:rPr>
-          <w:sz w:val="36"/>
-          <w:szCs w:val="36"/>
-        </w:rPr>
-      </w:pPr>
-    </w:p>
-    <w:p>
-      <w:pPr>
-        <w:rPr>
-          <w:sz w:val="36"/>
-          <w:szCs w:val="36"/>
-        </w:rPr>
-      </w:pPr>
-    </w:p>
-    <w:p>
-      <w:pPr>
-        <w:rPr>
-          <w:sz w:val="36"/>
-          <w:szCs w:val="36"/>
-        </w:rPr>
-      </w:pPr>
-    </w:p>
-    <w:p>
-      <w:pPr>
-        <w:rPr>
-          <w:sz w:val="36"/>
-          <w:szCs w:val="36"/>
-        </w:rPr>
-      </w:pPr>
-    </w:p>
-    <w:p>
-      <w:pPr>
-        <w:rPr>
-          <w:sz w:val="36"/>
-          <w:szCs w:val="36"/>
-        </w:rPr>
-      </w:pPr>
-    </w:p>
-    <w:p>
-      <w:pPr>
-        <w:rPr>
-          <w:sz w:val="36"/>
-          <w:szCs w:val="36"/>
-        </w:rPr>
-      </w:pPr>
-    </w:p>
-    <w:p>
-      <w:pPr>
+        <w:jc w:val="both"/>
+        <w:rPr>
+          <w:sz w:val="36"/>
+          <w:szCs w:val="36"/>
+        </w:rPr>
+      </w:pPr>
+    </w:p>
+    <w:p>
+      <w:pPr>
+        <w:jc w:val="both"/>
+        <w:rPr>
+          <w:sz w:val="36"/>
+          <w:szCs w:val="36"/>
+        </w:rPr>
+      </w:pPr>
+    </w:p>
+    <w:p>
+      <w:pPr>
+        <w:jc w:val="both"/>
+        <w:rPr>
+          <w:sz w:val="36"/>
+          <w:szCs w:val="36"/>
+        </w:rPr>
+      </w:pPr>
+    </w:p>
+    <w:p>
+      <w:pPr>
+        <w:jc w:val="both"/>
+        <w:rPr>
+          <w:sz w:val="36"/>
+          <w:szCs w:val="36"/>
+        </w:rPr>
+      </w:pPr>
+    </w:p>
+    <w:p>
+      <w:pPr>
+        <w:jc w:val="both"/>
+        <w:rPr>
+          <w:sz w:val="36"/>
+          <w:szCs w:val="36"/>
+        </w:rPr>
+      </w:pPr>
+    </w:p>
+    <w:p>
+      <w:pPr>
+        <w:jc w:val="both"/>
+        <w:rPr>
+          <w:sz w:val="36"/>
+          <w:szCs w:val="36"/>
+        </w:rPr>
+      </w:pPr>
+    </w:p>
+    <w:p>
+      <w:pPr>
+        <w:jc w:val="both"/>
         <w:rPr>
           <w:sz w:val="36"/>
           <w:szCs w:val="36"/>
@@ -2064,6 +2142,7 @@
     </w:p>
     <w:p>
       <w:pPr>
+        <w:jc w:val="both"/>
         <w:rPr>
           <w:sz w:val="36"/>
           <w:szCs w:val="36"/>
@@ -2134,54 +2213,61 @@
     </w:p>
     <w:p>
       <w:pPr>
-        <w:rPr>
-          <w:sz w:val="36"/>
-          <w:szCs w:val="36"/>
-        </w:rPr>
-      </w:pPr>
-    </w:p>
-    <w:p>
-      <w:pPr>
-        <w:rPr>
-          <w:sz w:val="36"/>
-          <w:szCs w:val="36"/>
-        </w:rPr>
-      </w:pPr>
-    </w:p>
-    <w:p>
-      <w:pPr>
-        <w:rPr>
-          <w:sz w:val="36"/>
-          <w:szCs w:val="36"/>
-        </w:rPr>
-      </w:pPr>
-    </w:p>
-    <w:p>
-      <w:pPr>
-        <w:rPr>
-          <w:sz w:val="36"/>
-          <w:szCs w:val="36"/>
-        </w:rPr>
-      </w:pPr>
-    </w:p>
-    <w:p>
-      <w:pPr>
-        <w:rPr>
-          <w:sz w:val="36"/>
-          <w:szCs w:val="36"/>
-        </w:rPr>
-      </w:pPr>
-    </w:p>
-    <w:p>
-      <w:pPr>
-        <w:rPr>
-          <w:sz w:val="36"/>
-          <w:szCs w:val="36"/>
-        </w:rPr>
-      </w:pPr>
-    </w:p>
-    <w:p>
-      <w:pPr>
+        <w:jc w:val="both"/>
+        <w:rPr>
+          <w:sz w:val="36"/>
+          <w:szCs w:val="36"/>
+        </w:rPr>
+      </w:pPr>
+    </w:p>
+    <w:p>
+      <w:pPr>
+        <w:jc w:val="both"/>
+        <w:rPr>
+          <w:sz w:val="36"/>
+          <w:szCs w:val="36"/>
+        </w:rPr>
+      </w:pPr>
+    </w:p>
+    <w:p>
+      <w:pPr>
+        <w:jc w:val="both"/>
+        <w:rPr>
+          <w:sz w:val="36"/>
+          <w:szCs w:val="36"/>
+        </w:rPr>
+      </w:pPr>
+    </w:p>
+    <w:p>
+      <w:pPr>
+        <w:jc w:val="both"/>
+        <w:rPr>
+          <w:sz w:val="36"/>
+          <w:szCs w:val="36"/>
+        </w:rPr>
+      </w:pPr>
+    </w:p>
+    <w:p>
+      <w:pPr>
+        <w:jc w:val="both"/>
+        <w:rPr>
+          <w:sz w:val="36"/>
+          <w:szCs w:val="36"/>
+        </w:rPr>
+      </w:pPr>
+    </w:p>
+    <w:p>
+      <w:pPr>
+        <w:jc w:val="both"/>
+        <w:rPr>
+          <w:sz w:val="36"/>
+          <w:szCs w:val="36"/>
+        </w:rPr>
+      </w:pPr>
+    </w:p>
+    <w:p>
+      <w:pPr>
+        <w:jc w:val="both"/>
         <w:rPr>
           <w:b/>
           <w:bCs/>
@@ -2221,6 +2307,7 @@
     </w:p>
     <w:p>
       <w:pPr>
+        <w:jc w:val="both"/>
         <w:rPr>
           <w:sz w:val="36"/>
           <w:szCs w:val="36"/>
@@ -2250,6 +2337,7 @@
     </w:p>
     <w:p>
       <w:pPr>
+        <w:jc w:val="both"/>
         <w:rPr>
           <w:sz w:val="36"/>
           <w:szCs w:val="36"/>
@@ -2336,6 +2424,7 @@
     </w:p>
     <w:p>
       <w:pPr>
+        <w:jc w:val="both"/>
         <w:rPr>
           <w:sz w:val="36"/>
           <w:szCs w:val="36"/>
@@ -2351,18 +2440,20 @@
     </w:p>
     <w:p>
       <w:pPr>
-        <w:rPr>
-          <w:sz w:val="36"/>
-          <w:szCs w:val="36"/>
-        </w:rPr>
-      </w:pPr>
-      <w:r>
-        <w:rPr>
+        <w:jc w:val="both"/>
+        <w:rPr>
+          <w:sz w:val="36"/>
+          <w:szCs w:val="36"/>
+        </w:rPr>
+      </w:pPr>
+      <w:r>
+        <w:rPr>
+          <w:noProof/>
           <w:sz w:val="36"/>
           <w:szCs w:val="36"/>
         </w:rPr>
         <w:drawing>
-          <wp:anchor distT="0" distB="0" distL="114300" distR="114300" simplePos="0" relativeHeight="251667456" behindDoc="1" locked="0" layoutInCell="1" allowOverlap="1" wp14:anchorId="0D82B111" wp14:editId="3E316545">
+          <wp:anchor distT="0" distB="0" distL="114300" distR="114300" simplePos="0" relativeHeight="251667456" behindDoc="1" locked="0" layoutInCell="1" allowOverlap="1" wp14:anchorId="0D82B111" wp14:editId="3DFDE17C">
             <wp:simplePos x="0" y="0"/>
             <wp:positionH relativeFrom="margin">
               <wp:align>right</wp:align>
@@ -2414,70 +2505,79 @@
     </w:p>
     <w:p>
       <w:pPr>
-        <w:rPr>
-          <w:sz w:val="36"/>
-          <w:szCs w:val="36"/>
-        </w:rPr>
-      </w:pPr>
-    </w:p>
-    <w:p>
-      <w:pPr>
-        <w:rPr>
-          <w:sz w:val="36"/>
-          <w:szCs w:val="36"/>
-        </w:rPr>
-      </w:pPr>
-    </w:p>
-    <w:p>
-      <w:pPr>
-        <w:rPr>
-          <w:sz w:val="36"/>
-          <w:szCs w:val="36"/>
-        </w:rPr>
-      </w:pPr>
-    </w:p>
-    <w:p>
-      <w:pPr>
-        <w:rPr>
-          <w:sz w:val="36"/>
-          <w:szCs w:val="36"/>
-        </w:rPr>
-      </w:pPr>
-    </w:p>
-    <w:p>
-      <w:pPr>
-        <w:rPr>
-          <w:sz w:val="36"/>
-          <w:szCs w:val="36"/>
-        </w:rPr>
-      </w:pPr>
-    </w:p>
-    <w:p>
-      <w:pPr>
-        <w:rPr>
-          <w:sz w:val="36"/>
-          <w:szCs w:val="36"/>
-        </w:rPr>
-      </w:pPr>
-    </w:p>
-    <w:p>
-      <w:pPr>
-        <w:rPr>
-          <w:sz w:val="36"/>
-          <w:szCs w:val="36"/>
-        </w:rPr>
-      </w:pPr>
-    </w:p>
-    <w:p>
-      <w:pPr>
-        <w:rPr>
-          <w:sz w:val="36"/>
-          <w:szCs w:val="36"/>
-        </w:rPr>
-      </w:pPr>
-    </w:p>
-    <w:p>
-      <w:pPr>
+        <w:jc w:val="both"/>
+        <w:rPr>
+          <w:sz w:val="36"/>
+          <w:szCs w:val="36"/>
+        </w:rPr>
+      </w:pPr>
+    </w:p>
+    <w:p>
+      <w:pPr>
+        <w:jc w:val="both"/>
+        <w:rPr>
+          <w:sz w:val="36"/>
+          <w:szCs w:val="36"/>
+        </w:rPr>
+      </w:pPr>
+    </w:p>
+    <w:p>
+      <w:pPr>
+        <w:jc w:val="both"/>
+        <w:rPr>
+          <w:sz w:val="36"/>
+          <w:szCs w:val="36"/>
+        </w:rPr>
+      </w:pPr>
+    </w:p>
+    <w:p>
+      <w:pPr>
+        <w:jc w:val="both"/>
+        <w:rPr>
+          <w:sz w:val="36"/>
+          <w:szCs w:val="36"/>
+        </w:rPr>
+      </w:pPr>
+    </w:p>
+    <w:p>
+      <w:pPr>
+        <w:jc w:val="both"/>
+        <w:rPr>
+          <w:sz w:val="36"/>
+          <w:szCs w:val="36"/>
+        </w:rPr>
+      </w:pPr>
+    </w:p>
+    <w:p>
+      <w:pPr>
+        <w:jc w:val="both"/>
+        <w:rPr>
+          <w:sz w:val="36"/>
+          <w:szCs w:val="36"/>
+        </w:rPr>
+      </w:pPr>
+    </w:p>
+    <w:p>
+      <w:pPr>
+        <w:jc w:val="both"/>
+        <w:rPr>
+          <w:sz w:val="36"/>
+          <w:szCs w:val="36"/>
+        </w:rPr>
+      </w:pPr>
+    </w:p>
+    <w:p>
+      <w:pPr>
+        <w:jc w:val="both"/>
+        <w:rPr>
+          <w:sz w:val="36"/>
+          <w:szCs w:val="36"/>
+        </w:rPr>
+      </w:pPr>
+    </w:p>
+    <w:p>
+      <w:pPr>
+        <w:jc w:val="both"/>
         <w:rPr>
           <w:b/>
           <w:bCs/>
@@ -2517,6 +2617,7 @@
     </w:p>
     <w:p>
       <w:pPr>
+        <w:jc w:val="both"/>
         <w:rPr>
           <w:sz w:val="36"/>
           <w:szCs w:val="36"/>
@@ -2581,6 +2682,7 @@
     </w:p>
     <w:p>
       <w:pPr>
+        <w:jc w:val="both"/>
         <w:rPr>
           <w:sz w:val="36"/>
           <w:szCs w:val="36"/>
@@ -2617,6 +2719,7 @@
     </w:p>
     <w:p>
       <w:pPr>
+        <w:jc w:val="both"/>
         <w:rPr>
           <w:sz w:val="36"/>
           <w:szCs w:val="36"/>
@@ -2639,6 +2742,7 @@
     </w:p>
     <w:p>
       <w:pPr>
+        <w:jc w:val="both"/>
         <w:rPr>
           <w:sz w:val="36"/>
           <w:szCs w:val="36"/>
@@ -2703,18 +2807,20 @@
     </w:p>
     <w:p>
       <w:pPr>
-        <w:rPr>
-          <w:sz w:val="36"/>
-          <w:szCs w:val="36"/>
-        </w:rPr>
-      </w:pPr>
-      <w:r>
-        <w:rPr>
+        <w:jc w:val="both"/>
+        <w:rPr>
+          <w:sz w:val="36"/>
+          <w:szCs w:val="36"/>
+        </w:rPr>
+      </w:pPr>
+      <w:r>
+        <w:rPr>
+          <w:noProof/>
           <w:sz w:val="36"/>
           <w:szCs w:val="36"/>
         </w:rPr>
         <w:drawing>
-          <wp:anchor distT="0" distB="0" distL="114300" distR="114300" simplePos="0" relativeHeight="251668480" behindDoc="1" locked="0" layoutInCell="1" allowOverlap="1" wp14:anchorId="4258DAEB" wp14:editId="1471B3D3">
+          <wp:anchor distT="0" distB="0" distL="114300" distR="114300" simplePos="0" relativeHeight="251668480" behindDoc="1" locked="0" layoutInCell="1" allowOverlap="1" wp14:anchorId="4258DAEB" wp14:editId="707119F6">
             <wp:simplePos x="0" y="0"/>
             <wp:positionH relativeFrom="column">
               <wp:posOffset>0</wp:posOffset>
@@ -2772,62 +2878,291 @@
     </w:p>
     <w:p>
       <w:pPr>
-        <w:rPr>
-          <w:sz w:val="36"/>
-          <w:szCs w:val="36"/>
-        </w:rPr>
-      </w:pPr>
-    </w:p>
-    <w:p>
-      <w:pPr>
-        <w:rPr>
-          <w:sz w:val="36"/>
-          <w:szCs w:val="36"/>
-        </w:rPr>
-      </w:pPr>
-    </w:p>
-    <w:p>
-      <w:pPr>
-        <w:rPr>
-          <w:sz w:val="36"/>
-          <w:szCs w:val="36"/>
-        </w:rPr>
-      </w:pPr>
-    </w:p>
-    <w:p>
-      <w:pPr>
-        <w:rPr>
-          <w:sz w:val="36"/>
-          <w:szCs w:val="36"/>
-        </w:rPr>
-      </w:pPr>
-    </w:p>
-    <w:p>
-      <w:pPr>
-        <w:rPr>
-          <w:sz w:val="36"/>
-          <w:szCs w:val="36"/>
-        </w:rPr>
-      </w:pPr>
-    </w:p>
-    <w:p>
-      <w:pPr>
-        <w:rPr>
-          <w:sz w:val="36"/>
-          <w:szCs w:val="36"/>
-        </w:rPr>
-      </w:pPr>
-    </w:p>
-    <w:p>
-      <w:pPr>
-        <w:rPr>
-          <w:sz w:val="36"/>
-          <w:szCs w:val="36"/>
-        </w:rPr>
-      </w:pPr>
-    </w:p>
-    <w:p>
-      <w:pPr>
+        <w:jc w:val="both"/>
+        <w:rPr>
+          <w:sz w:val="36"/>
+          <w:szCs w:val="36"/>
+        </w:rPr>
+      </w:pPr>
+    </w:p>
+    <w:p>
+      <w:pPr>
+        <w:jc w:val="both"/>
+        <w:rPr>
+          <w:sz w:val="36"/>
+          <w:szCs w:val="36"/>
+        </w:rPr>
+      </w:pPr>
+    </w:p>
+    <w:p>
+      <w:pPr>
+        <w:jc w:val="both"/>
+        <w:rPr>
+          <w:sz w:val="36"/>
+          <w:szCs w:val="36"/>
+        </w:rPr>
+      </w:pPr>
+    </w:p>
+    <w:p>
+      <w:pPr>
+        <w:jc w:val="both"/>
+        <w:rPr>
+          <w:sz w:val="36"/>
+          <w:szCs w:val="36"/>
+        </w:rPr>
+      </w:pPr>
+    </w:p>
+    <w:p>
+      <w:pPr>
+        <w:jc w:val="both"/>
+        <w:rPr>
+          <w:sz w:val="36"/>
+          <w:szCs w:val="36"/>
+        </w:rPr>
+      </w:pPr>
+    </w:p>
+    <w:p>
+      <w:pPr>
+        <w:jc w:val="both"/>
+        <w:rPr>
+          <w:sz w:val="36"/>
+          <w:szCs w:val="36"/>
+        </w:rPr>
+      </w:pPr>
+    </w:p>
+    <w:p>
+      <w:pPr>
+        <w:jc w:val="both"/>
+        <w:rPr>
+          <w:sz w:val="36"/>
+          <w:szCs w:val="36"/>
+        </w:rPr>
+      </w:pPr>
+    </w:p>
+    <w:p>
+      <w:pPr>
+        <w:jc w:val="both"/>
+        <w:rPr>
+          <w:sz w:val="36"/>
+          <w:szCs w:val="36"/>
+        </w:rPr>
+      </w:pPr>
+    </w:p>
+    <w:p>
+      <w:pPr>
+        <w:jc w:val="both"/>
+        <w:rPr>
+          <w:b/>
+          <w:bCs/>
+          <w:sz w:val="36"/>
+          <w:szCs w:val="36"/>
+        </w:rPr>
+      </w:pPr>
+      <w:r>
+        <w:rPr>
+          <w:b/>
+          <w:bCs/>
+          <w:sz w:val="36"/>
+          <w:szCs w:val="36"/>
+        </w:rPr>
+        <w:t>Set Collection Variables:</w:t>
+      </w:r>
+    </w:p>
+    <w:p>
+      <w:pPr>
+        <w:jc w:val="both"/>
+        <w:rPr>
+          <w:sz w:val="36"/>
+          <w:szCs w:val="36"/>
+        </w:rPr>
+      </w:pPr>
+      <w:r>
+        <w:rPr>
+          <w:sz w:val="36"/>
+          <w:szCs w:val="36"/>
+        </w:rPr>
+        <w:t># Instead of repeating the base URL in every single request file we can make it a variable instead.</w:t>
+      </w:r>
+    </w:p>
+    <w:p>
+      <w:pPr>
+        <w:jc w:val="both"/>
+        <w:rPr>
+          <w:sz w:val="36"/>
+          <w:szCs w:val="36"/>
+        </w:rPr>
+      </w:pPr>
+      <w:r>
+        <w:rPr>
+          <w:sz w:val="36"/>
+          <w:szCs w:val="36"/>
+        </w:rPr>
+        <w:lastRenderedPageBreak/>
+        <w:t xml:space="preserve"># To do that select all in the URL bar and right click and then select </w:t>
+      </w:r>
+      <w:r>
+        <w:rPr>
+          <w:b/>
+          <w:bCs/>
+          <w:sz w:val="36"/>
+          <w:szCs w:val="36"/>
+        </w:rPr>
+        <w:t>Set as variable</w:t>
+      </w:r>
+      <w:r>
+        <w:rPr>
+          <w:sz w:val="36"/>
+          <w:szCs w:val="36"/>
+        </w:rPr>
+        <w:t>, then set the variable name and scope (for Collection, Global, Environment or Vault). Usually, the scope is collection so it can be used throughout that testing collection in any request file</w:t>
+      </w:r>
+    </w:p>
+    <w:p>
+      <w:pPr>
+        <w:jc w:val="both"/>
+        <w:rPr>
+          <w:sz w:val="36"/>
+          <w:szCs w:val="36"/>
+        </w:rPr>
+      </w:pPr>
+      <w:r>
+        <w:rPr>
+          <w:sz w:val="36"/>
+          <w:szCs w:val="36"/>
+        </w:rPr>
+        <w:t xml:space="preserve"># Or go to Collection and then go to </w:t>
+      </w:r>
+      <w:r>
+        <w:rPr>
+          <w:b/>
+          <w:bCs/>
+          <w:sz w:val="36"/>
+          <w:szCs w:val="36"/>
+        </w:rPr>
+        <w:t>Variables</w:t>
+      </w:r>
+      <w:r>
+        <w:rPr>
+          <w:sz w:val="36"/>
+          <w:szCs w:val="36"/>
+        </w:rPr>
+        <w:t xml:space="preserve"> section and create a new variable with a value</w:t>
+      </w:r>
+    </w:p>
+    <w:p>
+      <w:pPr>
+        <w:jc w:val="both"/>
+        <w:rPr>
+          <w:sz w:val="36"/>
+          <w:szCs w:val="36"/>
+        </w:rPr>
+      </w:pPr>
+      <w:r>
+        <w:rPr>
+          <w:sz w:val="36"/>
+          <w:szCs w:val="36"/>
+        </w:rPr>
+        <w:t># Then we can use the variable like this</w:t>
+      </w:r>
+      <w:r>
+        <w:rPr>
+          <w:b/>
+          <w:bCs/>
+          <w:sz w:val="36"/>
+          <w:szCs w:val="36"/>
+        </w:rPr>
+        <w:t xml:space="preserve"> {{</w:t>
+      </w:r>
+      <w:proofErr w:type="spellStart"/>
+      <w:r>
+        <w:rPr>
+          <w:b/>
+          <w:bCs/>
+          <w:sz w:val="36"/>
+          <w:szCs w:val="36"/>
+        </w:rPr>
+        <w:t>BaseURL</w:t>
+      </w:r>
+      <w:proofErr w:type="spellEnd"/>
+      <w:r>
+        <w:rPr>
+          <w:b/>
+          <w:bCs/>
+          <w:sz w:val="36"/>
+          <w:szCs w:val="36"/>
+        </w:rPr>
+        <w:t>}}</w:t>
+      </w:r>
+    </w:p>
+    <w:p>
+      <w:pPr>
+        <w:jc w:val="both"/>
+        <w:rPr>
+          <w:sz w:val="36"/>
+          <w:szCs w:val="36"/>
+        </w:rPr>
+      </w:pPr>
+    </w:p>
+    <w:p>
+      <w:pPr>
+        <w:jc w:val="both"/>
+        <w:rPr>
+          <w:sz w:val="36"/>
+          <w:szCs w:val="36"/>
+        </w:rPr>
+      </w:pPr>
+      <w:r>
+        <w:rPr>
+          <w:sz w:val="36"/>
+          <w:szCs w:val="36"/>
+        </w:rPr>
+        <w:drawing>
+          <wp:inline distT="0" distB="0" distL="0" distR="0" wp14:anchorId="31D046CD" wp14:editId="10BAA38E">
+            <wp:extent cx="5731510" cy="1661160"/>
+            <wp:effectExtent l="0" t="0" r="2540" b="0"/>
+            <wp:docPr id="12" name="Picture 12"/>
+            <wp:cNvGraphicFramePr>
+              <a:graphicFrameLocks xmlns:a="http://schemas.openxmlformats.org/drawingml/2006/main" noChangeAspect="1"/>
+            </wp:cNvGraphicFramePr>
+            <a:graphic xmlns:a="http://schemas.openxmlformats.org/drawingml/2006/main">
+              <a:graphicData uri="http://schemas.openxmlformats.org/drawingml/2006/picture">
+                <pic:pic xmlns:pic="http://schemas.openxmlformats.org/drawingml/2006/picture">
+                  <pic:nvPicPr>
+                    <pic:cNvPr id="1" name=""/>
+                    <pic:cNvPicPr/>
+                  </pic:nvPicPr>
+                  <pic:blipFill rotWithShape="1">
+                    <a:blip r:embed="rId17"/>
+                    <a:srcRect b="54330"/>
+                    <a:stretch/>
+                  </pic:blipFill>
+                  <pic:spPr bwMode="auto">
+                    <a:xfrm>
+                      <a:off x="0" y="0"/>
+                      <a:ext cx="5731510" cy="1661160"/>
+                    </a:xfrm>
+                    <a:prstGeom prst="rect">
+                      <a:avLst/>
+                    </a:prstGeom>
+                    <a:ln>
+                      <a:noFill/>
+                    </a:ln>
+                    <a:extLst>
+                      <a:ext uri="{53640926-AAD7-44D8-BBD7-CCE9431645EC}">
+                        <a14:shadowObscured xmlns:a14="http://schemas.microsoft.com/office/drawing/2010/main"/>
+                      </a:ext>
+                    </a:extLst>
+                  </pic:spPr>
+                </pic:pic>
+              </a:graphicData>
+            </a:graphic>
+          </wp:inline>
+        </w:drawing>
+      </w:r>
+    </w:p>
+    <w:p>
+      <w:pPr>
+        <w:jc w:val="both"/>
         <w:rPr>
           <w:sz w:val="36"/>
           <w:szCs w:val="36"/>
@@ -2835,7 +3170,7 @@
       </w:pPr>
     </w:p>
     <w:sectPr>
-      <w:footerReference w:type="default" r:id="rId17"/>
+      <w:footerReference w:type="default" r:id="rId18"/>
       <w:pgSz w:w="11906" w:h="16838" w:code="9"/>
       <w:pgMar w:top="1440" w:right="1440" w:bottom="1440" w:left="1440" w:header="720" w:footer="720" w:gutter="0"/>
       <w:cols w:space="720"/>
@@ -3551,6 +3886,7 @@
   <w:style w:type="character" w:default="1" w:styleId="DefaultParagraphFont">
     <w:name w:val="Default Paragraph Font"/>
     <w:uiPriority w:val="1"/>
+    <w:semiHidden/>
     <w:unhideWhenUsed/>
   </w:style>
   <w:style w:type="table" w:default="1" w:styleId="TableNormal">

</xml_diff>